<commit_message>
Add a .NET and Angular variant of the workshop; move the Python kit to demo/python-fastapi
WALKTHROUGH-dotnet.md, the ccw5gd deck, workbook and pre-work, the Northwind Dispatch practice kit
(ASP.NET Core 10 and Angular 19, six cases, history as a git bundle), and a cross-platform harness
(templates/run-case.cs) that runs every case in its own Docker container, on its own clone.

The Python kit moves from demo/ to demo/python-fastapi/; demo/README.md now lists both kits.
Eval runs in both kits now leave personal setup out (--setting-sources project,local,
--strict-mcp-config, --no-session-persistence, and hooks and auto memory off), and the tracker's
"How isolated" list gains "Container per run".
</commit_message>
<xml_diff>
--- a/ccw5g-participant-workbook.docx
+++ b/ccw5g-participant-workbook.docx
@@ -11,7 +11,7 @@
           <wp:inline distT="0" distB="0" distL="0" distR="0">
             <wp:extent cx="1428750" cy="295275"/>
             <wp:effectExtent t="0" r="0" b="0" l="0"/>
-            <wp:docPr id="4" name="" descr="" title=""/>
+            <wp:docPr id="58" name="" descr="" title=""/>
             <wp:cNvGraphicFramePr>
               <a:graphicFrameLocks xmlns:a="http://schemas.openxmlformats.org/drawingml/2006/main" noChangeAspect="1"/>
             </wp:cNvGraphicFramePr>
@@ -102,7 +102,7 @@
           <wp:inline distT="0" distB="0" distL="0" distR="0">
             <wp:extent cx="5943600" cy="28575"/>
             <wp:effectExtent t="0" r="0" b="0" l="0"/>
-            <wp:docPr id="5" name="" descr="" title=""/>
+            <wp:docPr id="59" name="" descr="" title=""/>
             <wp:cNvGraphicFramePr>
               <a:graphicFrameLocks xmlns:a="http://schemas.openxmlformats.org/drawingml/2006/main" noChangeAspect="1"/>
             </wp:cNvGraphicFramePr>
@@ -3684,7 +3684,7 @@
           <w:sz w:val="22"/>
           <w:szCs w:val="22"/>
         </w:rPr>
-        <w:t xml:space="preserve">In the worktree, run the request exactly as written: claude -p "&lt;request&gt;" --settings &lt;eval-set&gt;/eval-run-settings.json --permission-mode acceptEdits --allowedTools "&lt;test command rule, such as Bash(pytest *)&gt;" --output-format json &gt; &lt;eval-set&gt;/outputs/&lt;case&gt;-run-1.json</w:t>
+        <w:t xml:space="preserve">In the worktree, run the request exactly as written: claude -p "&lt;request&gt;" --settings &lt;eval-set&gt;/eval-run-settings.json --permission-mode acceptEdits --setting-sources project,local --strict-mcp-config --no-session-persistence --allowedTools "&lt;test command rule, such as Bash(pytest *)&gt;" --output-format json &gt; &lt;eval-set&gt;/outputs/&lt;case&gt;-run-1.json</w:t>
       </w:r>
     </w:p>
     <w:p>
@@ -5284,7 +5284,7 @@
           <w:sz w:val="22"/>
           <w:szCs w:val="22"/>
         </w:rPr>
-        <w:t xml:space="preserve">In the run folder: claude -p "&lt;request&gt;" --settings &lt;eval-set&gt;/eval-run-settings.json --permission-mode acceptEdits --allowedTools "&lt;test command rule&gt;" --output-format json &gt; &lt;eval-set&gt;/outputs/&lt;case&gt;-run-1.json</w:t>
+        <w:t xml:space="preserve">In the run folder: claude -p "&lt;request&gt;" --settings &lt;eval-set&gt;/eval-run-settings.json --permission-mode acceptEdits --setting-sources project,local --strict-mcp-config --no-session-persistence --allowedTools "&lt;test command rule&gt;" --output-format json &gt; &lt;eval-set&gt;/outputs/&lt;case&gt;-run-1.json</w:t>
       </w:r>
     </w:p>
     <w:p>
@@ -6180,7 +6180,7 @@
         <wp:inline distT="0" distB="0" distL="0" distR="0">
           <wp:extent cx="152400" cy="76200"/>
           <wp:effectExtent t="0" r="0" b="0" l="0"/>
-          <wp:docPr id="6" name="" descr="" title=""/>
+          <wp:docPr id="60" name="" descr="" title=""/>
           <wp:cNvGraphicFramePr>
             <a:graphicFrameLocks xmlns:a="http://schemas.openxmlformats.org/drawingml/2006/main" noChangeAspect="1"/>
           </wp:cNvGraphicFramePr>

</xml_diff>

<commit_message>
Apply the participant walkthrough review fixes to both kits
Per-task pass-rate exit criterion in the tracker and docs; run-case.cs
setupEnv/setupFiles for private feeds, model variables, and the credential
source printed in Claude Code's precedence order; walkthrough, workbook,
and pre-work fixes for both audiences; .gitattributes for line endings.
</commit_message>
<xml_diff>
--- a/ccw5g-participant-workbook.docx
+++ b/ccw5g-participant-workbook.docx
@@ -1159,7 +1159,7 @@
                 <w:sz w:val="18"/>
                 <w:szCs w:val="18"/>
               </w:rPr>
-              <w:t xml:space="preserve">Good enough to merge means</w:t>
+              <w:t xml:space="preserve">Owner (role)</w:t>
             </w:r>
           </w:p>
         </w:tc>
@@ -1187,7 +1187,7 @@
                 <w:sz w:val="18"/>
                 <w:szCs w:val="18"/>
               </w:rPr>
-              <w:t xml:space="preserve">Never acceptable</w:t>
+              <w:t xml:space="preserve">What good output looks like: good enough to merge, and never acceptable</w:t>
             </w:r>
           </w:p>
         </w:tc>
@@ -1215,7 +1215,7 @@
                 <w:sz w:val="18"/>
                 <w:szCs w:val="18"/>
               </w:rPr>
-              <w:t xml:space="preserve">Reviewer rework that is acceptable</w:t>
+              <w:t xml:space="preserve">How often it happens</w:t>
             </w:r>
           </w:p>
         </w:tc>
@@ -1741,7 +1741,7 @@
                 <w:sz w:val="19"/>
                 <w:szCs w:val="19"/>
               </w:rPr>
-              <w:t xml:space="preserve">Target-task pass rate we need</w:t>
+              <w:t xml:space="preserve">Pass rate each target task must reach</w:t>
             </w:r>
           </w:p>
         </w:tc>
@@ -5341,7 +5341,7 @@
           <w:sz w:val="22"/>
           <w:szCs w:val="22"/>
         </w:rPr>
-        <w:t xml:space="preserve">All three runs in one command: run-case.sh --case &lt;case&gt; --repo &lt;repository&gt; --branch &lt;case-branch&gt; --request &lt;eval-set&gt;/&lt;case&gt;/request.md --test "&lt;test command&gt;" --allow "&lt;test command rule&gt;" --eval-set &lt;eval-set&gt; --runs-dir &lt;runs&gt; --reference-repo &lt;full clone&gt; --reference-ref &lt;merged commit&gt; --reference-tests "&lt;test paths&gt;"</w:t>
+        <w:t xml:space="preserve">All three runs in one command: run-case.sh --case &lt;case&gt; --repo &lt;repository&gt; --branch &lt;case-branch&gt; --request &lt;eval-set&gt;/&lt;case&gt;/request.md --test "&lt;test command&gt;" --allow "&lt;test command rule&gt;" --eval-set &lt;eval-set&gt; --runs-dir &lt;runs&gt; --reference-repo &lt;full clone&gt; --reference-ref &lt;merged commit&gt; --reference-files "&lt;test paths&gt;"</w:t>
       </w:r>
     </w:p>
     <w:p>
@@ -5832,6 +5832,101 @@
           <w:szCs w:val="22"/>
         </w:rPr>
         <w:t xml:space="preserve">Stuck: post the word stuck in chat during an exercise, and the presenter comes to you.</w:t>
+      </w:r>
+    </w:p>
+    <w:p>
+      <w:pPr>
+        <w:pStyle w:val="ListParagraph"/>
+        <w:numPr>
+          <w:ilvl w:val="0"/>
+          <w:numId w:val="2"/>
+        </w:numPr>
+        <w:spacing w:after="80" w:line="290"/>
+      </w:pPr>
+      <w:r>
+        <w:rPr>
+          <w:rFonts w:ascii="Arial" w:cs="Arial" w:eastAsia="Arial" w:hAnsi="Arial"/>
+          <w:color w:val="262626"/>
+          <w:sz w:val="22"/>
+          <w:szCs w:val="22"/>
+        </w:rPr>
+        <w:t xml:space="preserve">Personal setup: what each engineer adds to Claude Code for themselves, kept in their home folder: plugins, hooks, MCP servers, a personal CLAUDE.md, and auto memory. The evaluation runs leave it out, so everyone measures the same Claude Code and no run can read notes an earlier run left behind.</w:t>
+      </w:r>
+    </w:p>
+    <w:p>
+      <w:pPr>
+        <w:pStyle w:val="ListParagraph"/>
+        <w:numPr>
+          <w:ilvl w:val="0"/>
+          <w:numId w:val="2"/>
+        </w:numPr>
+        <w:spacing w:after="80" w:line="290"/>
+      </w:pPr>
+      <w:r>
+        <w:rPr>
+          <w:rFonts w:ascii="Arial" w:cs="Arial" w:eastAsia="Arial" w:hAnsi="Arial"/>
+          <w:color w:val="262626"/>
+          <w:sz w:val="22"/>
+          <w:szCs w:val="22"/>
+        </w:rPr>
+        <w:t xml:space="preserve">Plugin: a package of add-ons, such as skills and hooks, installed into Claude Code.</w:t>
+      </w:r>
+    </w:p>
+    <w:p>
+      <w:pPr>
+        <w:pStyle w:val="ListParagraph"/>
+        <w:numPr>
+          <w:ilvl w:val="0"/>
+          <w:numId w:val="2"/>
+        </w:numPr>
+        <w:spacing w:after="80" w:line="290"/>
+      </w:pPr>
+      <w:r>
+        <w:rPr>
+          <w:rFonts w:ascii="Arial" w:cs="Arial" w:eastAsia="Arial" w:hAnsi="Arial"/>
+          <w:color w:val="262626"/>
+          <w:sz w:val="22"/>
+          <w:szCs w:val="22"/>
+        </w:rPr>
+        <w:t xml:space="preserve">Hook: a command Claude Code runs automatically at a set moment, such as when a session starts.</w:t>
+      </w:r>
+    </w:p>
+    <w:p>
+      <w:pPr>
+        <w:pStyle w:val="ListParagraph"/>
+        <w:numPr>
+          <w:ilvl w:val="0"/>
+          <w:numId w:val="2"/>
+        </w:numPr>
+        <w:spacing w:after="80" w:line="290"/>
+      </w:pPr>
+      <w:r>
+        <w:rPr>
+          <w:rFonts w:ascii="Arial" w:cs="Arial" w:eastAsia="Arial" w:hAnsi="Arial"/>
+          <w:color w:val="262626"/>
+          <w:sz w:val="22"/>
+          <w:szCs w:val="22"/>
+        </w:rPr>
+        <w:t xml:space="preserve">MCP server: a connection that gives Claude Code tools for another system, such as an issue tracker.</w:t>
+      </w:r>
+    </w:p>
+    <w:p>
+      <w:pPr>
+        <w:pStyle w:val="ListParagraph"/>
+        <w:numPr>
+          <w:ilvl w:val="0"/>
+          <w:numId w:val="2"/>
+        </w:numPr>
+        <w:spacing w:after="80" w:line="290"/>
+      </w:pPr>
+      <w:r>
+        <w:rPr>
+          <w:rFonts w:ascii="Arial" w:cs="Arial" w:eastAsia="Arial" w:hAnsi="Arial"/>
+          <w:color w:val="262626"/>
+          <w:sz w:val="22"/>
+          <w:szCs w:val="22"/>
+        </w:rPr>
+        <w:t xml:space="preserve">Auto memory: notes Claude Code saves between sessions and reads back at the start of the next one.</w:t>
       </w:r>
     </w:p>
     <w:p>

</xml_diff>

<commit_message>
Second walkthrough review: fix Track B harness bugs, add opt-in Track B features
run-case.cs/run-case.sh: clear message when a case branch is only origin/<branch>;
AWS variables only with Bedrock; image user takes the host uid on Linux/WSL;
cleanup on failure and Ctrl+C; byte-for-byte reference files; feed-file secrets
in the leak scan; rows copied to the clipboard without the header.
New, opt-in: --team-setup, tests with no network (testNetwork), per-run
services and env, and a browser image for Karma.
Docs: one case per target task for the .NET load, honest isolation wording,
local case branches, tracker guidance, answer-key agreement figures, and
routes for participants working on their own.
</commit_message>
<xml_diff>
--- a/ccw5g-participant-workbook.docx
+++ b/ccw5g-participant-workbook.docx
@@ -3608,7 +3608,7 @@
           <w:sz w:val="22"/>
           <w:szCs w:val="22"/>
         </w:rPr>
-        <w:t xml:space="preserve">Activate the repository's environment so its test command works. For a Python service: source .venv/bin/activate.</w:t>
+        <w:t xml:space="preserve">Activate the repository's environment so its test command works. In the practice kit, source ~/ccw5g/templates/start.sh does it; for your own Python service, run source .venv/bin/activate in its folder.</w:t>
       </w:r>
     </w:p>
     <w:p>
@@ -5927,6 +5927,82 @@
           <w:szCs w:val="22"/>
         </w:rPr>
         <w:t xml:space="preserve">Auto memory: notes Claude Code saves between sessions and reads back at the start of the next one.</w:t>
+      </w:r>
+    </w:p>
+    <w:p>
+      <w:pPr>
+        <w:pStyle w:val="ListParagraph"/>
+        <w:numPr>
+          <w:ilvl w:val="0"/>
+          <w:numId w:val="2"/>
+        </w:numPr>
+        <w:spacing w:after="80" w:line="290"/>
+      </w:pPr>
+      <w:r>
+        <w:rPr>
+          <w:rFonts w:ascii="Arial" w:cs="Arial" w:eastAsia="Arial" w:hAnsi="Arial"/>
+          <w:color w:val="262626"/>
+          <w:sz w:val="22"/>
+          <w:szCs w:val="22"/>
+        </w:rPr>
+        <w:t xml:space="preserve">Skill: a packaged set of instructions Claude Code loads for one kind of task, such as your team's testing conventions. Build a skill is one of the five decisions.</w:t>
+      </w:r>
+    </w:p>
+    <w:p>
+      <w:pPr>
+        <w:pStyle w:val="ListParagraph"/>
+        <w:numPr>
+          <w:ilvl w:val="0"/>
+          <w:numId w:val="2"/>
+        </w:numPr>
+        <w:spacing w:after="80" w:line="290"/>
+      </w:pPr>
+      <w:r>
+        <w:rPr>
+          <w:rFonts w:ascii="Arial" w:cs="Arial" w:eastAsia="Arial" w:hAnsi="Arial"/>
+          <w:color w:val="262626"/>
+          <w:sz w:val="22"/>
+          <w:szCs w:val="22"/>
+        </w:rPr>
+        <w:t xml:space="preserve">Clone: a copy of a git repository, with its history, in a folder of its own.</w:t>
+      </w:r>
+    </w:p>
+    <w:p>
+      <w:pPr>
+        <w:pStyle w:val="ListParagraph"/>
+        <w:numPr>
+          <w:ilvl w:val="0"/>
+          <w:numId w:val="2"/>
+        </w:numPr>
+        <w:spacing w:after="80" w:line="290"/>
+      </w:pPr>
+      <w:r>
+        <w:rPr>
+          <w:rFonts w:ascii="Arial" w:cs="Arial" w:eastAsia="Arial" w:hAnsi="Arial"/>
+          <w:color w:val="262626"/>
+          <w:sz w:val="22"/>
+          <w:szCs w:val="22"/>
+        </w:rPr>
+        <w:t xml:space="preserve">Branch: a named line of work in a repository. A case branch is one such name.</w:t>
+      </w:r>
+    </w:p>
+    <w:p>
+      <w:pPr>
+        <w:pStyle w:val="ListParagraph"/>
+        <w:numPr>
+          <w:ilvl w:val="0"/>
+          <w:numId w:val="2"/>
+        </w:numPr>
+        <w:spacing w:after="80" w:line="290"/>
+      </w:pPr>
+      <w:r>
+        <w:rPr>
+          <w:rFonts w:ascii="Arial" w:cs="Arial" w:eastAsia="Arial" w:hAnsi="Arial"/>
+          <w:color w:val="262626"/>
+          <w:sz w:val="22"/>
+          <w:szCs w:val="22"/>
+        </w:rPr>
+        <w:t xml:space="preserve">Diff: the lines a change adds and removes, as git diff shows them: + for added, - for removed.</w:t>
       </w:r>
     </w:p>
     <w:p>

</xml_diff>